<commit_message>
Enrich Italian market deliverable with new entrants and event dates
</commit_message>
<xml_diff>
--- a/Word/6_Marche_Italien_TO_a_demarcher.docx
+++ b/Word/6_Marche_Italien_TO_a_demarcher.docx
@@ -1232,43 +1232,95 @@
               <w:jc w:val="left"/>
             </w:pPr>
             <w:r>
-              <w:t xml:space="preserve">Mistral Tour / Guiness Travel / archètravel</w:t>
-            </w:r>
-          </w:p>
-        </w:tc>
-        <w:tc>
-          <w:tcPr/>
-          <w:p>
-            <w:pPr>
-              <w:pStyle w:val="Compact"/>
-              <w:jc w:val="left"/>
-            </w:pPr>
-            <w:r>
-              <w:t xml:space="preserve">À vérifier</w:t>
-            </w:r>
-          </w:p>
-        </w:tc>
-        <w:tc>
-          <w:tcPr/>
-          <w:p>
-            <w:pPr>
-              <w:pStyle w:val="Compact"/>
-              <w:jc w:val="left"/>
-            </w:pPr>
-            <w:r>
-              <w:t xml:space="preserve">circuits culturels</w:t>
-            </w:r>
-          </w:p>
-        </w:tc>
-        <w:tc>
-          <w:tcPr/>
-          <w:p>
-            <w:pPr>
-              <w:pStyle w:val="Compact"/>
-              <w:jc w:val="left"/>
-            </w:pPr>
-            <w:r>
-              <w:t xml:space="preserve">Cibles secondaires culture</w:t>
+              <w:rPr>
+                <w:bCs/>
+                <w:b/>
+              </w:rPr>
+              <w:t xml:space="preserve">Quality Group / Mistral Tour</w:t>
+            </w:r>
+          </w:p>
+        </w:tc>
+        <w:tc>
+          <w:tcPr/>
+          <w:p>
+            <w:pPr>
+              <w:pStyle w:val="Compact"/>
+              <w:jc w:val="left"/>
+            </w:pPr>
+            <w:r>
+              <w:t xml:space="preserve">✅ Actif (catalogue Tunisie 2026-2027)</w:t>
+            </w:r>
+          </w:p>
+        </w:tc>
+        <w:tc>
+          <w:tcPr/>
+          <w:p>
+            <w:pPr>
+              <w:pStyle w:val="Compact"/>
+              <w:jc w:val="left"/>
+            </w:pPr>
+            <w:r>
+              <w:t xml:space="preserve">“</w:t>
+            </w:r>
+            <w:r>
+              <w:t xml:space="preserve">Gran Tour Tunisia</w:t>
+            </w:r>
+            <w:r>
+              <w:t xml:space="preserve">”</w:t>
+            </w:r>
+            <w:r>
+              <w:t xml:space="preserve"> </w:t>
+            </w:r>
+            <w:r>
+              <w:t xml:space="preserve">12j,</w:t>
+            </w:r>
+            <w:r>
+              <w:t xml:space="preserve"> </w:t>
+            </w:r>
+            <w:r>
+              <w:t xml:space="preserve">“</w:t>
+            </w:r>
+            <w:r>
+              <w:t xml:space="preserve">Experience Tunisia</w:t>
+            </w:r>
+            <w:r>
+              <w:t xml:space="preserve">”</w:t>
+            </w:r>
+            <w:r>
+              <w:t xml:space="preserve"> </w:t>
+            </w:r>
+            <w:r>
+              <w:t xml:space="preserve">9j,</w:t>
+            </w:r>
+            <w:r>
+              <w:t xml:space="preserve"> </w:t>
+            </w:r>
+            <w:r>
+              <w:t xml:space="preserve">“</w:t>
+            </w:r>
+            <w:r>
+              <w:t xml:space="preserve">Meraviglie del Sud</w:t>
+            </w:r>
+            <w:r>
+              <w:t xml:space="preserve">”</w:t>
+            </w:r>
+            <w:r>
+              <w:t xml:space="preserve"> </w:t>
+            </w:r>
+            <w:r>
+              <w:t xml:space="preserve">8j</w:t>
+            </w:r>
+          </w:p>
+        </w:tc>
+        <w:tc>
+          <w:tcPr/>
+          <w:p>
+            <w:pPr>
+              <w:pStyle w:val="Compact"/>
+              <w:jc w:val="left"/>
+            </w:pPr>
+            <w:r>
+              <w:t xml:space="preserve">Volume circuits, guides italophones</w:t>
             </w:r>
           </w:p>
         </w:tc>
@@ -1282,6 +1334,136 @@
               <w:jc w:val="left"/>
             </w:pPr>
             <w:r>
+              <w:rPr>
+                <w:bCs/>
+                <w:b/>
+              </w:rPr>
+              <w:t xml:space="preserve">African Explorer</w:t>
+            </w:r>
+          </w:p>
+        </w:tc>
+        <w:tc>
+          <w:tcPr/>
+          <w:p>
+            <w:pPr>
+              <w:pStyle w:val="Compact"/>
+              <w:jc w:val="left"/>
+            </w:pPr>
+            <w:r>
+              <w:t xml:space="preserve">✅</w:t>
+            </w:r>
+            <w:r>
+              <w:t xml:space="preserve"> </w:t>
+            </w:r>
+            <w:r>
+              <w:rPr>
+                <w:bCs/>
+                <w:b/>
+              </w:rPr>
+              <w:t xml:space="preserve">Nouvel entrant 2025</w:t>
+            </w:r>
+          </w:p>
+        </w:tc>
+        <w:tc>
+          <w:tcPr/>
+          <w:p>
+            <w:pPr>
+              <w:pStyle w:val="Compact"/>
+              <w:jc w:val="left"/>
+            </w:pPr>
+            <w:r>
+              <w:t xml:space="preserve">circuits</w:t>
+            </w:r>
+          </w:p>
+        </w:tc>
+        <w:tc>
+          <w:tcPr/>
+          <w:p>
+            <w:pPr>
+              <w:pStyle w:val="Compact"/>
+              <w:jc w:val="left"/>
+            </w:pPr>
+            <w:r>
+              <w:t xml:space="preserve">Cible chaude (vient d’ouvrir)</w:t>
+            </w:r>
+          </w:p>
+        </w:tc>
+      </w:tr>
+      <w:tr>
+        <w:tc>
+          <w:tcPr/>
+          <w:p>
+            <w:pPr>
+              <w:pStyle w:val="Compact"/>
+              <w:jc w:val="left"/>
+            </w:pPr>
+            <w:r>
+              <w:rPr>
+                <w:bCs/>
+                <w:b/>
+              </w:rPr>
+              <w:t xml:space="preserve">Viaggi del Turchese</w:t>
+            </w:r>
+          </w:p>
+        </w:tc>
+        <w:tc>
+          <w:tcPr/>
+          <w:p>
+            <w:pPr>
+              <w:pStyle w:val="Compact"/>
+              <w:jc w:val="left"/>
+            </w:pPr>
+            <w:r>
+              <w:t xml:space="preserve">✅ Actif (charters Bergame)</w:t>
+            </w:r>
+          </w:p>
+        </w:tc>
+        <w:tc>
+          <w:tcPr/>
+          <w:p>
+            <w:pPr>
+              <w:pStyle w:val="Compact"/>
+              <w:jc w:val="left"/>
+            </w:pPr>
+            <w:r>
+              <w:t xml:space="preserve">Tunisie</w:t>
+            </w:r>
+            <w:r>
+              <w:t xml:space="preserve"> </w:t>
+            </w:r>
+            <w:r>
+              <w:t xml:space="preserve">“</w:t>
+            </w:r>
+            <w:r>
+              <w:t xml:space="preserve">à plein régime</w:t>
+            </w:r>
+            <w:r>
+              <w:t xml:space="preserve">”</w:t>
+            </w:r>
+          </w:p>
+        </w:tc>
+        <w:tc>
+          <w:tcPr/>
+          <w:p>
+            <w:pPr>
+              <w:pStyle w:val="Compact"/>
+              <w:jc w:val="left"/>
+            </w:pPr>
+            <w:r>
+              <w:t xml:space="preserve">Cible</w:t>
+            </w:r>
+          </w:p>
+        </w:tc>
+      </w:tr>
+      <w:tr>
+        <w:tc>
+          <w:tcPr/>
+          <w:p>
+            <w:pPr>
+              <w:pStyle w:val="Compact"/>
+              <w:jc w:val="left"/>
+            </w:pPr>
+            <w:r>
               <w:t xml:space="preserve">Originaltour / Naar / Idee per Viaggiare</w:t>
             </w:r>
           </w:p>
@@ -1324,6 +1506,78 @@
         </w:tc>
       </w:tr>
     </w:tbl>
+    <w:p>
+      <w:pPr>
+        <w:pStyle w:val="BlockText"/>
+      </w:pPr>
+      <w:r>
+        <w:t xml:space="preserve">💡</w:t>
+      </w:r>
+      <w:r>
+        <w:t xml:space="preserve"> </w:t>
+      </w:r>
+      <w:r>
+        <w:rPr>
+          <w:bCs/>
+          <w:b/>
+        </w:rPr>
+        <w:t xml:space="preserve">Note Veratour</w:t>
+      </w:r>
+      <w:r>
+        <w:t xml:space="preserve"> </w:t>
+      </w:r>
+      <w:r>
+        <w:t xml:space="preserve">: Tunisie</w:t>
+      </w:r>
+      <w:r>
+        <w:t xml:space="preserve"> </w:t>
+      </w:r>
+      <w:r>
+        <w:rPr>
+          <w:bCs/>
+          <w:b/>
+        </w:rPr>
+        <w:t xml:space="preserve">+69 %</w:t>
+      </w:r>
+      <w:r>
+        <w:t xml:space="preserve"> </w:t>
+      </w:r>
+      <w:r>
+        <w:t xml:space="preserve">à sa convention 2025, top-seller 2026.</w:t>
+      </w:r>
+      <w:r>
+        <w:t xml:space="preserve"> </w:t>
+      </w:r>
+      <w:r>
+        <w:rPr>
+          <w:bCs/>
+          <w:b/>
+        </w:rPr>
+        <w:t xml:space="preserve">Explore Worldwide (UK)</w:t>
+      </w:r>
+      <w:r>
+        <w:t xml:space="preserve"> </w:t>
+      </w:r>
+      <w:r>
+        <w:t xml:space="preserve">ouvre même des</w:t>
+      </w:r>
+      <w:r>
+        <w:t xml:space="preserve"> </w:t>
+      </w:r>
+      <w:r>
+        <w:rPr>
+          <w:bCs/>
+          <w:b/>
+        </w:rPr>
+        <w:t xml:space="preserve">tours éclipse solaire 2027</w:t>
+      </w:r>
+      <w:r>
+        <w:t xml:space="preserve"> </w:t>
+      </w:r>
+      <w:r>
+        <w:t xml:space="preserve">en Tunisie — angle à exploiter.</w:t>
+      </w:r>
+    </w:p>
     <w:p>
       <w:r>
         <w:pict>

</xml_diff>